<commit_message>
User Manual 1.2.3 and Release Notes rebuilt: role-aware Home on My Work
</commit_message>
<xml_diff>
--- a/docs/package/06_Support/BrokerVerse_Release_Notes_and_Roadmap.docx
+++ b/docs/package/06_Support/BrokerVerse_Release_Notes_and_Roadmap.docx
@@ -789,7 +789,7 @@
             </w:rPr>
             <w:fldChar w:fldCharType="separate"/>
           </w:r>
-          <w:hyperlink w:anchor="__RefHeading___Toc99610_1894618434">
+          <w:hyperlink w:anchor="__RefHeading___Toc28921_3679192306">
             <w:r>
               <w:rPr>
                 <w:webHidden/>
@@ -824,7 +824,7 @@
             </w:tabs>
             <w:rPr/>
           </w:pPr>
-          <w:hyperlink w:anchor="__RefHeading___Toc99612_1894618434">
+          <w:hyperlink w:anchor="__RefHeading___Toc28923_3679192306">
             <w:r>
               <w:rPr>
                 <w:webHidden/>
@@ -853,7 +853,7 @@
             </w:tabs>
             <w:rPr/>
           </w:pPr>
-          <w:hyperlink w:anchor="__RefHeading___Toc99614_1894618434">
+          <w:hyperlink w:anchor="__RefHeading___Toc28925_3679192306">
             <w:r>
               <w:rPr>
                 <w:webHidden/>
@@ -875,7 +875,7 @@
             </w:tabs>
             <w:rPr/>
           </w:pPr>
-          <w:hyperlink w:anchor="__RefHeading___Toc99616_1894618434">
+          <w:hyperlink w:anchor="__RefHeading___Toc28927_3679192306">
             <w:r>
               <w:rPr>
                 <w:webHidden/>
@@ -897,7 +897,7 @@
             </w:tabs>
             <w:rPr/>
           </w:pPr>
-          <w:hyperlink w:anchor="__RefHeading___Toc99618_1894618434">
+          <w:hyperlink w:anchor="__RefHeading___Toc28929_3679192306">
             <w:r>
               <w:rPr>
                 <w:webHidden/>
@@ -919,7 +919,7 @@
             </w:tabs>
             <w:rPr/>
           </w:pPr>
-          <w:hyperlink w:anchor="__RefHeading___Toc99620_1894618434">
+          <w:hyperlink w:anchor="__RefHeading___Toc28931_3679192306">
             <w:r>
               <w:rPr>
                 <w:webHidden/>
@@ -941,7 +941,7 @@
             </w:tabs>
             <w:rPr/>
           </w:pPr>
-          <w:hyperlink w:anchor="__RefHeading___Toc99622_1894618434">
+          <w:hyperlink w:anchor="__RefHeading___Toc28933_3679192306">
             <w:r>
               <w:rPr>
                 <w:webHidden/>
@@ -963,7 +963,7 @@
             </w:tabs>
             <w:rPr/>
           </w:pPr>
-          <w:hyperlink w:anchor="__RefHeading___Toc99624_1894618434">
+          <w:hyperlink w:anchor="__RefHeading___Toc28935_3679192306">
             <w:r>
               <w:rPr>
                 <w:webHidden/>
@@ -971,7 +971,7 @@
               </w:rPr>
               <w:t>4.2 Go-live and release tooling</w:t>
               <w:tab/>
-              <w:t>7</w:t>
+              <w:t>8</w:t>
             </w:r>
           </w:hyperlink>
         </w:p>
@@ -985,7 +985,7 @@
             </w:tabs>
             <w:rPr/>
           </w:pPr>
-          <w:hyperlink w:anchor="__RefHeading___Toc99626_1894618434">
+          <w:hyperlink w:anchor="__RefHeading___Toc28937_3679192306">
             <w:r>
               <w:rPr>
                 <w:webHidden/>
@@ -1007,7 +1007,7 @@
             </w:tabs>
             <w:rPr/>
           </w:pPr>
-          <w:hyperlink w:anchor="__RefHeading___Toc99628_1894618434">
+          <w:hyperlink w:anchor="__RefHeading___Toc28939_3679192306">
             <w:r>
               <w:rPr>
                 <w:webHidden/>
@@ -1029,7 +1029,7 @@
             </w:tabs>
             <w:rPr/>
           </w:pPr>
-          <w:hyperlink w:anchor="__RefHeading___Toc99630_1894618434">
+          <w:hyperlink w:anchor="__RefHeading___Toc28941_3679192306">
             <w:r>
               <w:rPr>
                 <w:webHidden/>
@@ -1051,7 +1051,7 @@
             </w:tabs>
             <w:rPr/>
           </w:pPr>
-          <w:hyperlink w:anchor="__RefHeading___Toc99632_1894618434">
+          <w:hyperlink w:anchor="__RefHeading___Toc28943_3679192306">
             <w:r>
               <w:rPr>
                 <w:webHidden/>
@@ -1073,7 +1073,7 @@
             </w:tabs>
             <w:rPr/>
           </w:pPr>
-          <w:hyperlink w:anchor="__RefHeading___Toc99634_1894618434">
+          <w:hyperlink w:anchor="__RefHeading___Toc28945_3679192306">
             <w:r>
               <w:rPr>
                 <w:webHidden/>
@@ -1095,7 +1095,7 @@
             </w:tabs>
             <w:rPr/>
           </w:pPr>
-          <w:hyperlink w:anchor="__RefHeading___Toc99636_1894618434">
+          <w:hyperlink w:anchor="__RefHeading___Toc28947_3679192306">
             <w:r>
               <w:rPr>
                 <w:webHidden/>
@@ -1117,7 +1117,7 @@
             </w:tabs>
             <w:rPr/>
           </w:pPr>
-          <w:hyperlink w:anchor="__RefHeading___Toc99638_1894618434">
+          <w:hyperlink w:anchor="__RefHeading___Toc28949_3679192306">
             <w:r>
               <w:rPr>
                 <w:webHidden/>
@@ -1139,7 +1139,7 @@
             </w:tabs>
             <w:rPr/>
           </w:pPr>
-          <w:hyperlink w:anchor="__RefHeading___Toc99640_1894618434">
+          <w:hyperlink w:anchor="__RefHeading___Toc28951_3679192306">
             <w:r>
               <w:rPr>
                 <w:webHidden/>
@@ -1161,7 +1161,7 @@
             </w:tabs>
             <w:rPr/>
           </w:pPr>
-          <w:hyperlink w:anchor="__RefHeading___Toc99642_1894618434">
+          <w:hyperlink w:anchor="__RefHeading___Toc28953_3679192306">
             <w:r>
               <w:rPr>
                 <w:webHidden/>
@@ -1183,7 +1183,7 @@
             </w:tabs>
             <w:rPr/>
           </w:pPr>
-          <w:hyperlink w:anchor="__RefHeading___Toc99644_1894618434">
+          <w:hyperlink w:anchor="__RefHeading___Toc28955_3679192306">
             <w:r>
               <w:rPr>
                 <w:webHidden/>
@@ -1205,7 +1205,7 @@
             </w:tabs>
             <w:rPr/>
           </w:pPr>
-          <w:hyperlink w:anchor="__RefHeading___Toc99646_1894618434">
+          <w:hyperlink w:anchor="__RefHeading___Toc28957_3679192306">
             <w:r>
               <w:rPr>
                 <w:webHidden/>
@@ -1227,7 +1227,7 @@
             </w:tabs>
             <w:rPr/>
           </w:pPr>
-          <w:hyperlink w:anchor="__RefHeading___Toc99648_1894618434">
+          <w:hyperlink w:anchor="__RefHeading___Toc28959_3679192306">
             <w:r>
               <w:rPr>
                 <w:webHidden/>
@@ -1249,7 +1249,7 @@
             </w:tabs>
             <w:rPr/>
           </w:pPr>
-          <w:hyperlink w:anchor="__RefHeading___Toc99650_1894618434">
+          <w:hyperlink w:anchor="__RefHeading___Toc28961_3679192306">
             <w:r>
               <w:rPr>
                 <w:webHidden/>
@@ -1271,7 +1271,7 @@
             </w:tabs>
             <w:rPr/>
           </w:pPr>
-          <w:hyperlink w:anchor="__RefHeading___Toc99652_1894618434">
+          <w:hyperlink w:anchor="__RefHeading___Toc28963_3679192306">
             <w:r>
               <w:rPr>
                 <w:webHidden/>
@@ -1293,7 +1293,7 @@
             </w:tabs>
             <w:rPr/>
           </w:pPr>
-          <w:hyperlink w:anchor="__RefHeading___Toc99654_1894618434">
+          <w:hyperlink w:anchor="__RefHeading___Toc28965_3679192306">
             <w:r>
               <w:rPr>
                 <w:webHidden/>
@@ -1315,7 +1315,7 @@
             </w:tabs>
             <w:rPr/>
           </w:pPr>
-          <w:hyperlink w:anchor="__RefHeading___Toc99656_1894618434">
+          <w:hyperlink w:anchor="__RefHeading___Toc28967_3679192306">
             <w:r>
               <w:rPr>
                 <w:webHidden/>
@@ -1337,7 +1337,7 @@
             </w:tabs>
             <w:rPr/>
           </w:pPr>
-          <w:hyperlink w:anchor="__RefHeading___Toc99658_1894618434">
+          <w:hyperlink w:anchor="__RefHeading___Toc28969_3679192306">
             <w:r>
               <w:rPr>
                 <w:webHidden/>
@@ -1359,7 +1359,7 @@
             </w:tabs>
             <w:rPr/>
           </w:pPr>
-          <w:hyperlink w:anchor="__RefHeading___Toc99660_1894618434">
+          <w:hyperlink w:anchor="__RefHeading___Toc28971_3679192306">
             <w:r>
               <w:rPr>
                 <w:webHidden/>
@@ -1381,7 +1381,7 @@
             </w:tabs>
             <w:rPr/>
           </w:pPr>
-          <w:hyperlink w:anchor="__RefHeading___Toc99662_1894618434">
+          <w:hyperlink w:anchor="__RefHeading___Toc28973_3679192306">
             <w:r>
               <w:rPr>
                 <w:webHidden/>
@@ -1403,7 +1403,7 @@
             </w:tabs>
             <w:rPr/>
           </w:pPr>
-          <w:hyperlink w:anchor="__RefHeading___Toc99664_1894618434">
+          <w:hyperlink w:anchor="__RefHeading___Toc28975_3679192306">
             <w:r>
               <w:rPr>
                 <w:webHidden/>
@@ -1425,7 +1425,7 @@
             </w:tabs>
             <w:rPr/>
           </w:pPr>
-          <w:hyperlink w:anchor="__RefHeading___Toc99666_1894618434">
+          <w:hyperlink w:anchor="__RefHeading___Toc28977_3679192306">
             <w:r>
               <w:rPr>
                 <w:webHidden/>
@@ -1447,7 +1447,7 @@
             </w:tabs>
             <w:rPr/>
           </w:pPr>
-          <w:hyperlink w:anchor="__RefHeading___Toc99668_1894618434">
+          <w:hyperlink w:anchor="__RefHeading___Toc28979_3679192306">
             <w:r>
               <w:rPr>
                 <w:webHidden/>
@@ -1469,7 +1469,7 @@
             </w:tabs>
             <w:rPr/>
           </w:pPr>
-          <w:hyperlink w:anchor="__RefHeading___Toc99670_1894618434">
+          <w:hyperlink w:anchor="__RefHeading___Toc28981_3679192306">
             <w:r>
               <w:rPr>
                 <w:webHidden/>
@@ -1491,7 +1491,7 @@
             </w:tabs>
             <w:rPr/>
           </w:pPr>
-          <w:hyperlink w:anchor="__RefHeading___Toc99672_1894618434">
+          <w:hyperlink w:anchor="__RefHeading___Toc28983_3679192306">
             <w:r>
               <w:rPr>
                 <w:webHidden/>
@@ -1513,7 +1513,7 @@
             </w:tabs>
             <w:rPr/>
           </w:pPr>
-          <w:hyperlink w:anchor="__RefHeading___Toc99674_1894618434">
+          <w:hyperlink w:anchor="__RefHeading___Toc28985_3679192306">
             <w:r>
               <w:rPr>
                 <w:webHidden/>
@@ -1535,7 +1535,7 @@
             </w:tabs>
             <w:rPr/>
           </w:pPr>
-          <w:hyperlink w:anchor="__RefHeading___Toc99676_1894618434">
+          <w:hyperlink w:anchor="__RefHeading___Toc28987_3679192306">
             <w:r>
               <w:rPr>
                 <w:webHidden/>
@@ -1557,7 +1557,7 @@
             </w:tabs>
             <w:rPr/>
           </w:pPr>
-          <w:hyperlink w:anchor="__RefHeading___Toc99678_1894618434">
+          <w:hyperlink w:anchor="__RefHeading___Toc28989_3679192306">
             <w:r>
               <w:rPr>
                 <w:webHidden/>
@@ -1579,7 +1579,7 @@
             </w:tabs>
             <w:rPr/>
           </w:pPr>
-          <w:hyperlink w:anchor="__RefHeading___Toc99680_1894618434">
+          <w:hyperlink w:anchor="__RefHeading___Toc28991_3679192306">
             <w:r>
               <w:rPr>
                 <w:webHidden/>
@@ -1627,7 +1627,7 @@
       <w:r>
         <w:br w:type="page"/>
       </w:r>
-      <w:bookmarkStart w:id="0" w:name="__RefHeading___Toc99610_1894618434"/>
+      <w:bookmarkStart w:id="0" w:name="__RefHeading___Toc28921_3679192306"/>
       <w:bookmarkStart w:id="1" w:name="_Toc48319687"/>
       <w:bookmarkStart w:id="2" w:name="_Toc11824118"/>
       <w:bookmarkEnd w:id="0"/>
@@ -2270,7 +2270,7 @@
           <w:spacing w:val="0"/>
         </w:rPr>
       </w:pPr>
-      <w:bookmarkStart w:id="4" w:name="__RefHeading___Toc99612_1894618434"/>
+      <w:bookmarkStart w:id="4" w:name="__RefHeading___Toc28923_3679192306"/>
       <w:bookmarkStart w:id="5" w:name="_Toc233203388"/>
       <w:bookmarkEnd w:id="4"/>
       <w:r>
@@ -6024,7 +6024,7 @@
         <w:pageBreakBefore w:val="false"/>
         <w:rPr/>
       </w:pPr>
-      <w:bookmarkStart w:id="6" w:name="__RefHeading___Toc99614_1894618434"/>
+      <w:bookmarkStart w:id="6" w:name="__RefHeading___Toc28925_3679192306"/>
       <w:bookmarkEnd w:id="6"/>
       <w:r>
         <w:rPr>
@@ -6041,7 +6041,7 @@
         <w:pStyle w:val="Heading2"/>
         <w:rPr/>
       </w:pPr>
-      <w:bookmarkStart w:id="7" w:name="__RefHeading___Toc99616_1894618434"/>
+      <w:bookmarkStart w:id="7" w:name="__RefHeading___Toc28927_3679192306"/>
       <w:bookmarkEnd w:id="7"/>
       <w:r>
         <w:rPr>
@@ -7227,7 +7227,7 @@
         <w:pStyle w:val="Heading2"/>
         <w:rPr/>
       </w:pPr>
-      <w:bookmarkStart w:id="8" w:name="__RefHeading___Toc99618_1894618434"/>
+      <w:bookmarkStart w:id="8" w:name="__RefHeading___Toc28929_3679192306"/>
       <w:bookmarkEnd w:id="8"/>
       <w:r>
         <w:rPr>
@@ -8758,7 +8758,7 @@
       <w:r>
         <w:br w:type="page"/>
       </w:r>
-      <w:bookmarkStart w:id="9" w:name="__RefHeading___Toc99620_1894618434"/>
+      <w:bookmarkStart w:id="9" w:name="__RefHeading___Toc28931_3679192306"/>
       <w:bookmarkEnd w:id="9"/>
       <w:r>
         <w:rPr>
@@ -8775,7 +8775,7 @@
         <w:pStyle w:val="Heading2"/>
         <w:rPr/>
       </w:pPr>
-      <w:bookmarkStart w:id="10" w:name="__RefHeading___Toc99622_1894618434"/>
+      <w:bookmarkStart w:id="10" w:name="__RefHeading___Toc28933_3679192306"/>
       <w:bookmarkEnd w:id="10"/>
       <w:r>
         <w:rPr>
@@ -9375,6 +9375,105 @@
                 <w:szCs w:val="24"/>
                 <w:lang w:val="en-US" w:eastAsia="ja-JP" w:bidi="ar-SA"/>
               </w:rPr>
+              <w:t>Home is My Work with a role preset and the landing page of every role after sign-in: the role's categories first, its default scope, its Calendar categories, one primary button and two or three role figures (</w:t>
+            </w:r>
+            <w:r>
+              <w:rPr>
+                <w:rFonts w:eastAsia="Consolas" w:cs="Consolas" w:ascii="Consolas" w:hAnsi="Consolas"/>
+                <w:color w:val="101820"/>
+                <w:kern w:val="0"/>
+                <w:sz w:val="16"/>
+                <w:szCs w:val="24"/>
+                <w:lang w:val="en-US" w:eastAsia="ja-JP" w:bidi="ar-SA"/>
+              </w:rPr>
+              <w:t>GET /my-work/figures</w:t>
+            </w:r>
+            <w:r>
+              <w:rPr>
+                <w:rFonts w:eastAsia="Segoe UI" w:cs="Segoe UI" w:ascii="Segoe UI" w:hAnsi="Segoe UI"/>
+                <w:color w:val="101820"/>
+                <w:kern w:val="0"/>
+                <w:sz w:val="18"/>
+                <w:szCs w:val="24"/>
+                <w:lang w:val="en-US" w:eastAsia="ja-JP" w:bidi="ar-SA"/>
+              </w:rPr>
+              <w:t>); new My Work sources for the compliance officer (EDD reviews, compliance deadlines, breach register), the accounting manager (bank reconciliations, period close) and the system administrator (users and access, system health); the former Home dashboard and Open Items pages are withdrawn and their addresses open Home</w:t>
+            </w:r>
+          </w:p>
+        </w:tc>
+        <w:tc>
+          <w:tcPr>
+            <w:tcW w:w="4506" w:type="dxa"/>
+            <w:tcBorders>
+              <w:top w:val="single" w:sz="4" w:space="0" w:color="BFC7D1"/>
+              <w:left w:val="single" w:sz="4" w:space="0" w:color="BFC7D1"/>
+              <w:bottom w:val="single" w:sz="4" w:space="0" w:color="BFC7D1"/>
+              <w:right w:val="single" w:sz="4" w:space="0" w:color="BFC7D1"/>
+            </w:tcBorders>
+          </w:tcPr>
+          <w:p>
+            <w:pPr>
+              <w:pStyle w:val="Normal"/>
+              <w:widowControl/>
+              <w:spacing w:lineRule="auto" w:line="240" w:before="0" w:after="20"/>
+              <w:jc w:val="left"/>
+              <w:rPr>
+                <w:rFonts w:ascii="Aptos" w:hAnsi="Aptos" w:eastAsia="ＭＳ 明朝" w:cs="Arial"/>
+                <w:kern w:val="0"/>
+                <w:sz w:val="24"/>
+                <w:szCs w:val="24"/>
+                <w:lang w:val="en-US" w:eastAsia="ja-JP" w:bidi="ar-SA"/>
+              </w:rPr>
+            </w:pPr>
+            <w:r>
+              <w:rPr>
+                <w:rFonts w:eastAsia="Segoe UI" w:cs="Segoe UI" w:ascii="Segoe UI" w:hAnsi="Segoe UI"/>
+                <w:color w:val="101820"/>
+                <w:kern w:val="0"/>
+                <w:sz w:val="18"/>
+                <w:szCs w:val="24"/>
+                <w:lang w:val="en-US" w:eastAsia="ja-JP" w:bidi="ar-SA"/>
+              </w:rPr>
+              <w:t>Home; Operations &gt; My Work</w:t>
+            </w:r>
+          </w:p>
+        </w:tc>
+      </w:tr>
+      <w:tr>
+        <w:trPr/>
+        <w:tc>
+          <w:tcPr>
+            <w:tcW w:w="4507" w:type="dxa"/>
+            <w:tcBorders>
+              <w:top w:val="single" w:sz="4" w:space="0" w:color="BFC7D1"/>
+              <w:left w:val="single" w:sz="4" w:space="0" w:color="BFC7D1"/>
+              <w:bottom w:val="single" w:sz="4" w:space="0" w:color="BFC7D1"/>
+              <w:right w:val="single" w:sz="4" w:space="0" w:color="BFC7D1"/>
+            </w:tcBorders>
+          </w:tcPr>
+          <w:p>
+            <w:pPr>
+              <w:pStyle w:val="Normal"/>
+              <w:widowControl/>
+              <w:spacing w:lineRule="auto" w:line="240" w:before="0" w:after="20"/>
+              <w:jc w:val="left"/>
+              <w:rPr>
+                <w:rFonts w:ascii="Aptos" w:hAnsi="Aptos" w:eastAsia="ＭＳ 明朝" w:cs="Arial"/>
+                <w:kern w:val="0"/>
+                <w:sz w:val="24"/>
+                <w:szCs w:val="24"/>
+                <w:lang w:val="en-US" w:eastAsia="ja-JP" w:bidi="ar-SA"/>
+              </w:rPr>
+            </w:pPr>
+            <w:r>
+              <w:rPr>
+                <w:rFonts w:eastAsia="Segoe UI" w:cs="Segoe UI" w:ascii="Segoe UI" w:hAnsi="Segoe UI"/>
+                <w:color w:val="101820"/>
+                <w:kern w:val="0"/>
+                <w:sz w:val="18"/>
+                <w:szCs w:val="24"/>
+                <w:lang w:val="en-US" w:eastAsia="ja-JP" w:bidi="ar-SA"/>
+              </w:rPr>
               <w:t>Product Configurator in the business flow: acceptance rules (refer, decline, loading) with authority, rating factors, document templates with merge fields, market mapping and the governing template applied to quotations (migration 0252)</w:t>
             </w:r>
           </w:p>
@@ -9587,7 +9686,7 @@
         <w:pStyle w:val="Heading2"/>
         <w:rPr/>
       </w:pPr>
-      <w:bookmarkStart w:id="11" w:name="__RefHeading___Toc99624_1894618434"/>
+      <w:bookmarkStart w:id="11" w:name="__RefHeading___Toc28935_3679192306"/>
       <w:bookmarkEnd w:id="11"/>
       <w:r>
         <w:rPr>
@@ -10333,7 +10432,7 @@
         <w:pStyle w:val="Heading2"/>
         <w:rPr/>
       </w:pPr>
-      <w:bookmarkStart w:id="12" w:name="__RefHeading___Toc99626_1894618434"/>
+      <w:bookmarkStart w:id="12" w:name="__RefHeading___Toc28937_3679192306"/>
       <w:bookmarkEnd w:id="12"/>
       <w:r>
         <w:rPr>
@@ -10969,7 +11068,7 @@
         <w:pStyle w:val="Heading2"/>
         <w:rPr/>
       </w:pPr>
-      <w:bookmarkStart w:id="13" w:name="__RefHeading___Toc99628_1894618434"/>
+      <w:bookmarkStart w:id="13" w:name="__RefHeading___Toc28939_3679192306"/>
       <w:bookmarkEnd w:id="13"/>
       <w:r>
         <w:rPr>
@@ -11583,7 +11682,7 @@
         <w:pStyle w:val="Heading2"/>
         <w:rPr/>
       </w:pPr>
-      <w:bookmarkStart w:id="14" w:name="__RefHeading___Toc99630_1894618434"/>
+      <w:bookmarkStart w:id="14" w:name="__RefHeading___Toc28941_3679192306"/>
       <w:bookmarkEnd w:id="14"/>
       <w:r>
         <w:rPr>
@@ -12329,7 +12428,7 @@
         <w:pStyle w:val="Heading2"/>
         <w:rPr/>
       </w:pPr>
-      <w:bookmarkStart w:id="15" w:name="__RefHeading___Toc99632_1894618434"/>
+      <w:bookmarkStart w:id="15" w:name="__RefHeading___Toc28943_3679192306"/>
       <w:bookmarkEnd w:id="15"/>
       <w:r>
         <w:rPr>
@@ -13152,7 +13251,7 @@
         <w:pStyle w:val="Heading2"/>
         <w:rPr/>
       </w:pPr>
-      <w:bookmarkStart w:id="16" w:name="__RefHeading___Toc99634_1894618434"/>
+      <w:bookmarkStart w:id="16" w:name="__RefHeading___Toc28945_3679192306"/>
       <w:bookmarkEnd w:id="16"/>
       <w:r>
         <w:rPr>
@@ -13685,7 +13784,7 @@
         <w:pStyle w:val="Heading1"/>
         <w:rPr/>
       </w:pPr>
-      <w:bookmarkStart w:id="17" w:name="__RefHeading___Toc99636_1894618434"/>
+      <w:bookmarkStart w:id="17" w:name="__RefHeading___Toc28947_3679192306"/>
       <w:bookmarkEnd w:id="17"/>
       <w:r>
         <w:rPr>
@@ -13702,7 +13801,7 @@
         <w:pStyle w:val="Heading2"/>
         <w:rPr/>
       </w:pPr>
-      <w:bookmarkStart w:id="18" w:name="__RefHeading___Toc99638_1894618434"/>
+      <w:bookmarkStart w:id="18" w:name="__RefHeading___Toc28949_3679192306"/>
       <w:bookmarkEnd w:id="18"/>
       <w:r>
         <w:rPr>
@@ -13750,7 +13849,7 @@
         <w:pStyle w:val="Heading2"/>
         <w:rPr/>
       </w:pPr>
-      <w:bookmarkStart w:id="19" w:name="__RefHeading___Toc99640_1894618434"/>
+      <w:bookmarkStart w:id="19" w:name="__RefHeading___Toc28951_3679192306"/>
       <w:bookmarkEnd w:id="19"/>
       <w:r>
         <w:rPr>
@@ -14148,7 +14247,7 @@
         <w:pStyle w:val="Heading2"/>
         <w:rPr/>
       </w:pPr>
-      <w:bookmarkStart w:id="20" w:name="__RefHeading___Toc99642_1894618434"/>
+      <w:bookmarkStart w:id="20" w:name="__RefHeading___Toc28953_3679192306"/>
       <w:bookmarkEnd w:id="20"/>
       <w:r>
         <w:rPr>
@@ -15326,7 +15425,7 @@
         <w:pStyle w:val="Heading2"/>
         <w:rPr/>
       </w:pPr>
-      <w:bookmarkStart w:id="21" w:name="__RefHeading___Toc99644_1894618434"/>
+      <w:bookmarkStart w:id="21" w:name="__RefHeading___Toc28955_3679192306"/>
       <w:bookmarkEnd w:id="21"/>
       <w:r>
         <w:rPr>
@@ -16781,7 +16880,7 @@
         <w:pStyle w:val="Heading2"/>
         <w:rPr/>
       </w:pPr>
-      <w:bookmarkStart w:id="22" w:name="__RefHeading___Toc99646_1894618434"/>
+      <w:bookmarkStart w:id="22" w:name="__RefHeading___Toc28957_3679192306"/>
       <w:bookmarkEnd w:id="22"/>
       <w:r>
         <w:rPr>
@@ -16957,7 +17056,7 @@
         <w:pStyle w:val="Heading1"/>
         <w:rPr/>
       </w:pPr>
-      <w:bookmarkStart w:id="23" w:name="__RefHeading___Toc99648_1894618434"/>
+      <w:bookmarkStart w:id="23" w:name="__RefHeading___Toc28959_3679192306"/>
       <w:bookmarkEnd w:id="23"/>
       <w:r>
         <w:rPr>
@@ -16974,7 +17073,7 @@
         <w:pStyle w:val="Heading2"/>
         <w:rPr/>
       </w:pPr>
-      <w:bookmarkStart w:id="24" w:name="__RefHeading___Toc99650_1894618434"/>
+      <w:bookmarkStart w:id="24" w:name="__RefHeading___Toc28961_3679192306"/>
       <w:bookmarkEnd w:id="24"/>
       <w:r>
         <w:rPr>
@@ -17022,7 +17121,7 @@
         <w:pStyle w:val="Heading2"/>
         <w:rPr/>
       </w:pPr>
-      <w:bookmarkStart w:id="25" w:name="__RefHeading___Toc99652_1894618434"/>
+      <w:bookmarkStart w:id="25" w:name="__RefHeading___Toc28963_3679192306"/>
       <w:bookmarkEnd w:id="25"/>
       <w:r>
         <w:rPr>
@@ -17648,7 +17747,7 @@
         <w:pStyle w:val="Heading2"/>
         <w:rPr/>
       </w:pPr>
-      <w:bookmarkStart w:id="26" w:name="__RefHeading___Toc99654_1894618434"/>
+      <w:bookmarkStart w:id="26" w:name="__RefHeading___Toc28965_3679192306"/>
       <w:bookmarkEnd w:id="26"/>
       <w:r>
         <w:rPr>
@@ -18609,7 +18708,7 @@
       <w:r>
         <w:br w:type="page"/>
       </w:r>
-      <w:bookmarkStart w:id="27" w:name="__RefHeading___Toc99656_1894618434"/>
+      <w:bookmarkStart w:id="27" w:name="__RefHeading___Toc28967_3679192306"/>
       <w:bookmarkEnd w:id="27"/>
       <w:r>
         <w:rPr>
@@ -18626,7 +18725,7 @@
         <w:pStyle w:val="Heading2"/>
         <w:rPr/>
       </w:pPr>
-      <w:bookmarkStart w:id="28" w:name="__RefHeading___Toc99658_1894618434"/>
+      <w:bookmarkStart w:id="28" w:name="__RefHeading___Toc28969_3679192306"/>
       <w:bookmarkEnd w:id="28"/>
       <w:r>
         <w:rPr>
@@ -19708,7 +19807,7 @@
         <w:pStyle w:val="Heading2"/>
         <w:rPr/>
       </w:pPr>
-      <w:bookmarkStart w:id="29" w:name="__RefHeading___Toc99660_1894618434"/>
+      <w:bookmarkStart w:id="29" w:name="__RefHeading___Toc28971_3679192306"/>
       <w:bookmarkEnd w:id="29"/>
       <w:r>
         <w:rPr>
@@ -19925,7 +20024,7 @@
         <w:pStyle w:val="Heading1"/>
         <w:rPr/>
       </w:pPr>
-      <w:bookmarkStart w:id="30" w:name="__RefHeading___Toc99662_1894618434"/>
+      <w:bookmarkStart w:id="30" w:name="__RefHeading___Toc28973_3679192306"/>
       <w:bookmarkEnd w:id="30"/>
       <w:r>
         <w:rPr>
@@ -19942,7 +20041,7 @@
         <w:pStyle w:val="Heading2"/>
         <w:rPr/>
       </w:pPr>
-      <w:bookmarkStart w:id="31" w:name="__RefHeading___Toc99664_1894618434"/>
+      <w:bookmarkStart w:id="31" w:name="__RefHeading___Toc28975_3679192306"/>
       <w:bookmarkEnd w:id="31"/>
       <w:r>
         <w:rPr>
@@ -20652,7 +20751,7 @@
         <w:pStyle w:val="Heading2"/>
         <w:rPr/>
       </w:pPr>
-      <w:bookmarkStart w:id="32" w:name="__RefHeading___Toc99666_1894618434"/>
+      <w:bookmarkStart w:id="32" w:name="__RefHeading___Toc28977_3679192306"/>
       <w:bookmarkEnd w:id="32"/>
       <w:r>
         <w:rPr>
@@ -20764,7 +20863,7 @@
         <w:pStyle w:val="Heading2"/>
         <w:rPr/>
       </w:pPr>
-      <w:bookmarkStart w:id="33" w:name="__RefHeading___Toc99668_1894618434"/>
+      <w:bookmarkStart w:id="33" w:name="__RefHeading___Toc28979_3679192306"/>
       <w:bookmarkEnd w:id="33"/>
       <w:r>
         <w:rPr>
@@ -20841,7 +20940,7 @@
         <w:pStyle w:val="Heading1"/>
         <w:rPr/>
       </w:pPr>
-      <w:bookmarkStart w:id="34" w:name="__RefHeading___Toc99670_1894618434"/>
+      <w:bookmarkStart w:id="34" w:name="__RefHeading___Toc28981_3679192306"/>
       <w:bookmarkEnd w:id="34"/>
       <w:r>
         <w:rPr>
@@ -20884,7 +20983,7 @@
         <w:pStyle w:val="Heading2"/>
         <w:rPr/>
       </w:pPr>
-      <w:bookmarkStart w:id="35" w:name="__RefHeading___Toc99672_1894618434"/>
+      <w:bookmarkStart w:id="35" w:name="__RefHeading___Toc28983_3679192306"/>
       <w:bookmarkEnd w:id="35"/>
       <w:r>
         <w:rPr>
@@ -21867,7 +21966,7 @@
         <w:pStyle w:val="Heading2"/>
         <w:rPr/>
       </w:pPr>
-      <w:bookmarkStart w:id="36" w:name="__RefHeading___Toc99674_1894618434"/>
+      <w:bookmarkStart w:id="36" w:name="__RefHeading___Toc28985_3679192306"/>
       <w:bookmarkEnd w:id="36"/>
       <w:r>
         <w:rPr>
@@ -22382,7 +22481,7 @@
         <w:pStyle w:val="Heading2"/>
         <w:rPr/>
       </w:pPr>
-      <w:bookmarkStart w:id="37" w:name="__RefHeading___Toc99676_1894618434"/>
+      <w:bookmarkStart w:id="37" w:name="__RefHeading___Toc28987_3679192306"/>
       <w:bookmarkEnd w:id="37"/>
       <w:r>
         <w:rPr>
@@ -22820,7 +22919,7 @@
         <w:pStyle w:val="Heading2"/>
         <w:rPr/>
       </w:pPr>
-      <w:bookmarkStart w:id="38" w:name="__RefHeading___Toc99678_1894618434"/>
+      <w:bookmarkStart w:id="38" w:name="__RefHeading___Toc28989_3679192306"/>
       <w:bookmarkEnd w:id="38"/>
       <w:r>
         <w:rPr>
@@ -23213,7 +23312,7 @@
           <w:spacing w:val="0"/>
         </w:rPr>
       </w:pPr>
-      <w:bookmarkStart w:id="39" w:name="__RefHeading___Toc99680_1894618434"/>
+      <w:bookmarkStart w:id="39" w:name="__RefHeading___Toc28991_3679192306"/>
       <w:bookmarkStart w:id="40" w:name="_Toc233203395"/>
       <w:bookmarkEnd w:id="39"/>
       <w:r>

</xml_diff>